<commit_message>
Auto-save: 2 file(s) — 2026-09-29 10:03
</commit_message>
<xml_diff>
--- a/Notes/2026-09-29-iso-27001-stage1-marketing-submission.docx
+++ b/Notes/2026-09-29-iso-27001-stage1-marketing-submission.docx
@@ -288,7 +288,7 @@
                 <w:sz w:val="18"/>
                 <w:szCs w:val="18"/>
               </w:rPr>
-              <w:t xml:space="preserve">1.0</w:t>
+              <w:t xml:space="preserve">1.1 (updated 29 September 2026: slide library, Kore.ai one-pager, new website positioning)</w:t>
             </w:r>
           </w:p>
         </w:tc>
@@ -1306,6 +1306,218 @@
           <w:szCs w:val="21"/>
         </w:rPr>
         <w:t xml:space="preserve">Corporate decks position the company as “AI Consulting | Digital Engineering” with the line “Where Impactful AI Begins”. The official tagline in the brand guidelines is “Exceeding Expectations”.</w:t>
+      </w:r>
+    </w:p>
+    <w:p>
+      <w:pPr>
+        <w:pStyle w:val="Heading2"/>
+        <w:keepNext/>
+        <w:spacing w:after="120" w:before="240"/>
+      </w:pPr>
+      <w:r>
+        <w:rPr>
+          <w:rFonts w:ascii="Calibri" w:cs="Calibri" w:eastAsia="Calibri" w:hAnsi="Calibri"/>
+          <w:b/>
+          <w:bCs/>
+          <w:color w:val="1F2A44"/>
+          <w:sz w:val="24"/>
+          <w:szCs w:val="24"/>
+        </w:rPr>
+        <w:t xml:space="preserve">1.1a Positioning on the new website (launching October 2026)</w:t>
+      </w:r>
+    </w:p>
+    <w:p>
+      <w:pPr>
+        <w:spacing w:after="120"/>
+      </w:pPr>
+      <w:r>
+        <w:rPr>
+          <w:rFonts w:ascii="Calibri" w:cs="Calibri" w:eastAsia="Calibri" w:hAnsi="Calibri"/>
+          <w:sz w:val="21"/>
+          <w:szCs w:val="21"/>
+        </w:rPr>
+        <w:t xml:space="preserve">The website revamp moves xLoop's positioning toward data and AI. The approved homepage copy:</w:t>
+      </w:r>
+    </w:p>
+    <w:p>
+      <w:pPr>
+        <w:pStyle w:val="ListParagraph"/>
+        <w:numPr>
+          <w:ilvl w:val="0"/>
+          <w:numId w:val="2"/>
+        </w:numPr>
+        <w:spacing w:after="60"/>
+      </w:pPr>
+      <w:r>
+        <w:rPr>
+          <w:rFonts w:ascii="Calibri" w:cs="Calibri" w:eastAsia="Calibri" w:hAnsi="Calibri"/>
+          <w:b/>
+          <w:bCs/>
+          <w:sz w:val="21"/>
+          <w:szCs w:val="21"/>
+        </w:rPr>
+        <w:t xml:space="preserve">Positioning line: </w:t>
+      </w:r>
+      <w:r>
+        <w:rPr>
+          <w:rFonts w:ascii="Calibri" w:cs="Calibri" w:eastAsia="Calibri" w:hAnsi="Calibri"/>
+          <w:sz w:val="21"/>
+          <w:szCs w:val="21"/>
+        </w:rPr>
+        <w:t xml:space="preserve">Enterprise AI &amp; Data Consulting</w:t>
+      </w:r>
+    </w:p>
+    <w:p>
+      <w:pPr>
+        <w:pStyle w:val="ListParagraph"/>
+        <w:numPr>
+          <w:ilvl w:val="0"/>
+          <w:numId w:val="2"/>
+        </w:numPr>
+        <w:spacing w:after="60"/>
+      </w:pPr>
+      <w:r>
+        <w:rPr>
+          <w:rFonts w:ascii="Calibri" w:cs="Calibri" w:eastAsia="Calibri" w:hAnsi="Calibri"/>
+          <w:b/>
+          <w:bCs/>
+          <w:sz w:val="21"/>
+          <w:szCs w:val="21"/>
+        </w:rPr>
+        <w:t xml:space="preserve">Headline: </w:t>
+      </w:r>
+      <w:r>
+        <w:rPr>
+          <w:rFonts w:ascii="Calibri" w:cs="Calibri" w:eastAsia="Calibri" w:hAnsi="Calibri"/>
+          <w:sz w:val="21"/>
+          <w:szCs w:val="21"/>
+        </w:rPr>
+        <w:t xml:space="preserve">“Got Data or Chaos? We fix both.”</w:t>
+      </w:r>
+    </w:p>
+    <w:p>
+      <w:pPr>
+        <w:pStyle w:val="ListParagraph"/>
+        <w:numPr>
+          <w:ilvl w:val="0"/>
+          <w:numId w:val="2"/>
+        </w:numPr>
+        <w:spacing w:after="60"/>
+      </w:pPr>
+      <w:r>
+        <w:rPr>
+          <w:rFonts w:ascii="Calibri" w:cs="Calibri" w:eastAsia="Calibri" w:hAnsi="Calibri"/>
+          <w:b/>
+          <w:bCs/>
+          <w:sz w:val="21"/>
+          <w:szCs w:val="21"/>
+        </w:rPr>
+        <w:t xml:space="preserve">Summary: </w:t>
+      </w:r>
+      <w:r>
+        <w:rPr>
+          <w:rFonts w:ascii="Calibri" w:cs="Calibri" w:eastAsia="Calibri" w:hAnsi="Calibri"/>
+          <w:sz w:val="21"/>
+          <w:szCs w:val="21"/>
+        </w:rPr>
+        <w:t xml:space="preserve">“Turn fragmented data streams, legacy bottlenecks, and manual processes into predictable, high-yield AI pipelines. Our work spans data platform engineering, cloud migration, AI-assisted legacy modernization, and generative AI deployment, with every engagement grounded in delivered client work.”</w:t>
+      </w:r>
+    </w:p>
+    <w:p>
+      <w:pPr>
+        <w:pStyle w:val="ListParagraph"/>
+        <w:numPr>
+          <w:ilvl w:val="0"/>
+          <w:numId w:val="2"/>
+        </w:numPr>
+        <w:spacing w:after="60"/>
+      </w:pPr>
+      <w:r>
+        <w:rPr>
+          <w:rFonts w:ascii="Calibri" w:cs="Calibri" w:eastAsia="Calibri" w:hAnsi="Calibri"/>
+          <w:b/>
+          <w:bCs/>
+          <w:sz w:val="21"/>
+          <w:szCs w:val="21"/>
+        </w:rPr>
+        <w:t xml:space="preserve">Featured offer: </w:t>
+      </w:r>
+      <w:r>
+        <w:rPr>
+          <w:rFonts w:ascii="Calibri" w:cs="Calibri" w:eastAsia="Calibri" w:hAnsi="Calibri"/>
+          <w:sz w:val="21"/>
+          <w:szCs w:val="21"/>
+        </w:rPr>
+        <w:t xml:space="preserve">Data &amp; AI Readiness Diagnostic (“Is Your Data Ready for AI?”), with a 30-minute Data &amp; AI Readiness Review as the main call to action</w:t>
+      </w:r>
+    </w:p>
+    <w:p>
+      <w:pPr>
+        <w:pStyle w:val="ListParagraph"/>
+        <w:numPr>
+          <w:ilvl w:val="0"/>
+          <w:numId w:val="2"/>
+        </w:numPr>
+        <w:spacing w:after="60"/>
+      </w:pPr>
+      <w:r>
+        <w:rPr>
+          <w:rFonts w:ascii="Calibri" w:cs="Calibri" w:eastAsia="Calibri" w:hAnsi="Calibri"/>
+          <w:b/>
+          <w:bCs/>
+          <w:sz w:val="21"/>
+          <w:szCs w:val="21"/>
+        </w:rPr>
+        <w:t xml:space="preserve">Service structure: </w:t>
+      </w:r>
+      <w:r>
+        <w:rPr>
+          <w:rFonts w:ascii="Calibri" w:cs="Calibri" w:eastAsia="Calibri" w:hAnsi="Calibri"/>
+          <w:sz w:val="21"/>
+          <w:szCs w:val="21"/>
+        </w:rPr>
+        <w:t xml:space="preserve">services grouped into clusters. Digital Transformation is the hub for data analytics, cloud and hyperscaling, legacy system modernization, web and app development, and digital engineering. It is positioned as “Digital Transformation That Makes Enterprise AI Work”</w:t>
+      </w:r>
+    </w:p>
+    <w:p>
+      <w:pPr>
+        <w:pStyle w:val="ListParagraph"/>
+        <w:numPr>
+          <w:ilvl w:val="0"/>
+          <w:numId w:val="2"/>
+        </w:numPr>
+        <w:spacing w:after="60"/>
+      </w:pPr>
+      <w:r>
+        <w:rPr>
+          <w:rFonts w:ascii="Calibri" w:cs="Calibri" w:eastAsia="Calibri" w:hAnsi="Calibri"/>
+          <w:b/>
+          <w:bCs/>
+          <w:sz w:val="21"/>
+          <w:szCs w:val="21"/>
+        </w:rPr>
+        <w:t xml:space="preserve">Industries: </w:t>
+      </w:r>
+      <w:r>
+        <w:rPr>
+          <w:rFonts w:ascii="Calibri" w:cs="Calibri" w:eastAsia="Calibri" w:hAnsi="Calibri"/>
+          <w:sz w:val="21"/>
+          <w:szCs w:val="21"/>
+        </w:rPr>
+        <w:t xml:space="preserve">reduced from nine to six, with Mining added</w:t>
+      </w:r>
+    </w:p>
+    <w:p>
+      <w:pPr>
+        <w:spacing w:after="120"/>
+      </w:pPr>
+      <w:r>
+        <w:rPr>
+          <w:rFonts w:ascii="Calibri" w:cs="Calibri" w:eastAsia="Calibri" w:hAnsi="Calibri"/>
+          <w:sz w:val="21"/>
+          <w:szCs w:val="21"/>
+        </w:rPr>
+        <w:t xml:space="preserve">Until launch, the live website in Section 3 is what external parties see. This document describes both.</w:t>
       </w:r>
     </w:p>
     <w:p>
@@ -5694,7 +5906,7 @@
                 <w:sz w:val="18"/>
                 <w:szCs w:val="18"/>
               </w:rPr>
-              <w:t xml:space="preserve">Corporate Deck V10</w:t>
+              <w:t xml:space="preserve">Company slide library (Decks.pptx)</w:t>
             </w:r>
           </w:p>
         </w:tc>
@@ -5717,7 +5929,7 @@
                 <w:sz w:val="18"/>
                 <w:szCs w:val="18"/>
               </w:rPr>
-              <w:t xml:space="preserve">PPTX + PDF, June 2026</w:t>
+              <w:t xml:space="preserve">PPTX, SharePoint, maintained by the creative lead; updated continuously</w:t>
             </w:r>
           </w:p>
         </w:tc>
@@ -5740,7 +5952,7 @@
                 <w:sz w:val="18"/>
                 <w:szCs w:val="18"/>
               </w:rPr>
-              <w:t xml:space="preserve">Main company presentation for prospects and partners</w:t>
+              <w:t xml:space="preserve">Master source for all company presentations. Every new slide is added here; each team builds a deck from it for its audience and situation</w:t>
             </w:r>
           </w:p>
         </w:tc>
@@ -5763,7 +5975,7 @@
                 <w:sz w:val="18"/>
                 <w:szCs w:val="18"/>
               </w:rPr>
-              <w:t xml:space="preserve">Attach. Confirm V10 vs Corporate Deck 11 (May 2026)</w:t>
+              <w:t xml:space="preserve">Attach an export or share the link. This is the controlled current version</w:t>
             </w:r>
           </w:p>
         </w:tc>
@@ -5788,7 +6000,7 @@
                 <w:sz w:val="18"/>
                 <w:szCs w:val="18"/>
               </w:rPr>
-              <w:t xml:space="preserve">Solutions Focus deck</w:t>
+              <w:t xml:space="preserve">Earlier standalone decks (Corporate Deck V10, Corporate Deck 11, Solutions Focus deck)</w:t>
             </w:r>
           </w:p>
         </w:tc>
@@ -5811,7 +6023,7 @@
                 <w:sz w:val="18"/>
                 <w:szCs w:val="18"/>
               </w:rPr>
-              <w:t xml:space="preserve">PPTX, April 2026</w:t>
+              <w:t xml:space="preserve">PPTX / PDF, April–June 2026</w:t>
             </w:r>
           </w:p>
         </w:tc>
@@ -5834,7 +6046,7 @@
                 <w:sz w:val="18"/>
                 <w:szCs w:val="18"/>
               </w:rPr>
-              <w:t xml:space="preserve">Services and solutions overview</w:t>
+              <w:t xml:space="preserve">Older snapshots assembled from the library</w:t>
             </w:r>
           </w:p>
         </w:tc>
@@ -5857,7 +6069,7 @@
                 <w:sz w:val="18"/>
                 <w:szCs w:val="18"/>
               </w:rPr>
-              <w:t xml:space="preserve">Confirm</w:t>
+              <w:t xml:space="preserve">Superseded by the slide library. Not sent</w:t>
             </w:r>
           </w:p>
         </w:tc>
@@ -6586,7 +6798,7 @@
                 <w:sz w:val="18"/>
                 <w:szCs w:val="18"/>
               </w:rPr>
-              <w:t xml:space="preserve">Co-marketing with a technology partner</w:t>
+              <w:t xml:space="preserve">Made for one partner presentation to Kore.ai; used in that meeting</w:t>
             </w:r>
           </w:p>
         </w:tc>
@@ -6609,7 +6821,7 @@
                 <w:sz w:val="18"/>
                 <w:szCs w:val="18"/>
               </w:rPr>
-              <w:t xml:space="preserve">Confirm if released</w:t>
+              <w:t xml:space="preserve">Released for that audience only. Not for general circulation</w:t>
             </w:r>
           </w:p>
         </w:tc>
@@ -9144,7 +9356,7 @@
                 <w:sz w:val="18"/>
                 <w:szCs w:val="18"/>
               </w:rPr>
-              <w:t xml:space="preserve">Emeritus, Mari Energies, TPL Trakker, Sidat Hyder Morshed Associates, RTW, Itiner Digital, Optimaze, Bridgers; Kore.ai (co-marketing in progress)</w:t>
+              <w:t xml:space="preserve">Emeritus, Mari Energies, TPL Trakker, Sidat Hyder Morshed Associates, RTW, Itiner Digital, Optimaze, Bridgers; Kore.ai (partnership discussions; a one-pager was presented to them)</w:t>
             </w:r>
           </w:p>
         </w:tc>
@@ -10768,7 +10980,7 @@
                 <w:sz w:val="18"/>
                 <w:szCs w:val="18"/>
               </w:rPr>
-              <w:t xml:space="preserve">Different country counts across materials (“eight countries”, 7+, 10+)</w:t>
+              <w:t xml:space="preserve">Different country counts across materials (“eight countries”, 7+, 10+; the new homepage says “5 regions”)</w:t>
             </w:r>
           </w:p>
         </w:tc>
@@ -10791,7 +11003,7 @@
                 <w:sz w:val="18"/>
                 <w:szCs w:val="18"/>
               </w:rPr>
-              <w:t xml:space="preserve">NEPRA page; decks</w:t>
+              <w:t xml:space="preserve">NEPRA page; decks; new homepage</w:t>
             </w:r>
           </w:p>
         </w:tc>
@@ -11888,7 +12100,7 @@
                 <w:sz w:val="18"/>
                 <w:szCs w:val="18"/>
               </w:rPr>
-              <w:t xml:space="preserve">Marketing files are spread across personal OneDrive folders, Teams chat files and a former employee's folder, with several copies of each deck</w:t>
+              <w:t xml:space="preserve">Presentations are controlled through one slide library, but other material (case studies, one-pagers, press releases, videos) is spread across personal OneDrive folders, Teams chat files and a former employee's folder, with several copies of some files</w:t>
             </w:r>
           </w:p>
         </w:tc>
@@ -11934,7 +12146,7 @@
                 <w:sz w:val="18"/>
                 <w:szCs w:val="18"/>
               </w:rPr>
-              <w:t xml:space="preserve">Set up one controlled shared library with version naming and access control</w:t>
+              <w:t xml:space="preserve">Extend the slide-library approach: one shared library for all marketing material, with version naming and access control</w:t>
             </w:r>
           </w:p>
         </w:tc>
@@ -12688,7 +12900,7 @@
           <w:sz w:val="21"/>
           <w:szCs w:val="21"/>
         </w:rPr>
-        <w:t xml:space="preserve">Corporate Deck (current version)</w:t>
+        <w:t xml:space="preserve">Company slide library (Decks.pptx): export or SharePoint link</w:t>
       </w:r>
     </w:p>
     <w:p>

</xml_diff>

<commit_message>
Auto-save: 3 file(s) — 2026-09-29 10:33
</commit_message>
<xml_diff>
--- a/Notes/2026-09-29-iso-27001-stage1-marketing-submission.docx
+++ b/Notes/2026-09-29-iso-27001-stage1-marketing-submission.docx
@@ -288,7 +288,7 @@
                 <w:sz w:val="18"/>
                 <w:szCs w:val="18"/>
               </w:rPr>
-              <w:t xml:space="preserve">1.1 (updated 29 September 2026: slide library, Kore.ai one-pager, new website positioning)</w:t>
+              <w:t xml:space="preserve">1.2 (updated 29 September 2026: slide library review added as gap G14)</w:t>
             </w:r>
           </w:p>
         </w:tc>
@@ -5975,7 +5975,7 @@
                 <w:sz w:val="18"/>
                 <w:szCs w:val="18"/>
               </w:rPr>
-              <w:t xml:space="preserve">Attach an export or share the link. This is the controlled current version</w:t>
+              <w:t xml:space="preserve">Controlled source. Reviewed slide by slide on 29 Sep 2026; share the link once gap G14 is fixed</w:t>
             </w:r>
           </w:p>
         </w:tc>
@@ -12477,6 +12477,146 @@
           </w:p>
         </w:tc>
       </w:tr>
+      <w:tr>
+        <w:tc>
+          <w:tcPr>
+            <w:tcW w:type="dxa" w:w="459"/>
+            <w:tcMar>
+              <w:top w:type="dxa" w:w="60"/>
+              <w:left w:type="dxa" w:w="90"/>
+              <w:bottom w:type="dxa" w:w="60"/>
+              <w:right w:type="dxa" w:w="90"/>
+            </w:tcMar>
+          </w:tcPr>
+          <w:p>
+            <w:r>
+              <w:rPr>
+                <w:rFonts w:ascii="Calibri" w:cs="Calibri" w:eastAsia="Calibri" w:hAnsi="Calibri"/>
+                <w:b w:val="false"/>
+                <w:bCs w:val="false"/>
+                <w:sz w:val="18"/>
+                <w:szCs w:val="18"/>
+              </w:rPr>
+              <w:t xml:space="preserve">G14</w:t>
+            </w:r>
+          </w:p>
+        </w:tc>
+        <w:tc>
+          <w:tcPr>
+            <w:tcW w:type="dxa" w:w="2868"/>
+            <w:tcMar>
+              <w:top w:type="dxa" w:w="60"/>
+              <w:left w:type="dxa" w:w="90"/>
+              <w:bottom w:type="dxa" w:w="60"/>
+              <w:right w:type="dxa" w:w="90"/>
+            </w:tcMar>
+          </w:tcPr>
+          <w:p>
+            <w:r>
+              <w:rPr>
+                <w:rFonts w:ascii="Calibri" w:cs="Calibri" w:eastAsia="Calibri" w:hAnsi="Calibri"/>
+                <w:b w:val="false"/>
+                <w:bCs w:val="false"/>
+                <w:sz w:val="18"/>
+                <w:szCs w:val="18"/>
+              </w:rPr>
+              <w:t xml:space="preserve">Slide library review (110 slides, 29 Sep 2026) found company facts that contradict this document (120+ employees, 7+/10+ countries, 50+/75+ solutions), two slides tagged “ISO 27001 aligned”, blocked product statistics, client names without naming permission, and unsourced client result figures</w:t>
+            </w:r>
+          </w:p>
+        </w:tc>
+        <w:tc>
+          <w:tcPr>
+            <w:tcW w:type="dxa" w:w="1606"/>
+            <w:tcMar>
+              <w:top w:type="dxa" w:w="60"/>
+              <w:left w:type="dxa" w:w="90"/>
+              <w:bottom w:type="dxa" w:w="60"/>
+              <w:right w:type="dxa" w:w="90"/>
+            </w:tcMar>
+          </w:tcPr>
+          <w:p>
+            <w:r>
+              <w:rPr>
+                <w:rFonts w:ascii="Calibri" w:cs="Calibri" w:eastAsia="Calibri" w:hAnsi="Calibri"/>
+                <w:b w:val="false"/>
+                <w:bCs w:val="false"/>
+                <w:sz w:val="18"/>
+                <w:szCs w:val="18"/>
+              </w:rPr>
+              <w:t xml:space="preserve">Company slide library (Decks.pptx)</w:t>
+            </w:r>
+          </w:p>
+        </w:tc>
+        <w:tc>
+          <w:tcPr>
+            <w:tcW w:type="dxa" w:w="2295"/>
+            <w:tcMar>
+              <w:top w:type="dxa" w:w="60"/>
+              <w:left w:type="dxa" w:w="90"/>
+              <w:bottom w:type="dxa" w:w="60"/>
+              <w:right w:type="dxa" w:w="90"/>
+            </w:tcMar>
+          </w:tcPr>
+          <w:p>
+            <w:r>
+              <w:rPr>
+                <w:rFonts w:ascii="Calibri" w:cs="Calibri" w:eastAsia="Calibri" w:hAnsi="Calibri"/>
+                <w:b w:val="false"/>
+                <w:bCs w:val="false"/>
+                <w:sz w:val="18"/>
+                <w:szCs w:val="18"/>
+              </w:rPr>
+              <w:t xml:space="preserve">Correct the flagged slides; confirm client permissions and figure sources with Sales and Delivery; remove the ISO 27001-aligned tags</w:t>
+            </w:r>
+          </w:p>
+        </w:tc>
+        <w:tc>
+          <w:tcPr>
+            <w:tcW w:type="dxa" w:w="1377"/>
+            <w:tcMar>
+              <w:top w:type="dxa" w:w="60"/>
+              <w:left w:type="dxa" w:w="90"/>
+              <w:bottom w:type="dxa" w:w="60"/>
+              <w:right w:type="dxa" w:w="90"/>
+            </w:tcMar>
+          </w:tcPr>
+          <w:p>
+            <w:r>
+              <w:rPr>
+                <w:rFonts w:ascii="Calibri" w:cs="Calibri" w:eastAsia="Calibri" w:hAnsi="Calibri"/>
+                <w:b w:val="false"/>
+                <w:bCs w:val="false"/>
+                <w:sz w:val="18"/>
+                <w:szCs w:val="18"/>
+              </w:rPr>
+              <w:t xml:space="preserve">Marketing (creative lead) + Sales/Delivery</w:t>
+            </w:r>
+          </w:p>
+        </w:tc>
+        <w:tc>
+          <w:tcPr>
+            <w:tcW w:type="dxa" w:w="1033"/>
+            <w:tcMar>
+              <w:top w:type="dxa" w:w="60"/>
+              <w:left w:type="dxa" w:w="90"/>
+              <w:bottom w:type="dxa" w:w="60"/>
+              <w:right w:type="dxa" w:w="90"/>
+            </w:tcMar>
+          </w:tcPr>
+          <w:p>
+            <w:r>
+              <w:rPr>
+                <w:rFonts w:ascii="Calibri" w:cs="Calibri" w:eastAsia="Calibri" w:hAnsi="Calibri"/>
+                <w:b w:val="false"/>
+                <w:bCs w:val="false"/>
+                <w:sz w:val="18"/>
+                <w:szCs w:val="18"/>
+              </w:rPr>
+              <w:t xml:space="preserve">Oct 2026</w:t>
+            </w:r>
+          </w:p>
+        </w:tc>
+      </w:tr>
     </w:tbl>
     <w:p>
       <w:pPr>
@@ -12900,7 +13040,7 @@
           <w:sz w:val="21"/>
           <w:szCs w:val="21"/>
         </w:rPr>
-        <w:t xml:space="preserve">Company slide library (Decks.pptx): export or SharePoint link</w:t>
+        <w:t xml:space="preserve">Company slide library (Decks.pptx): SharePoint link, after the G14 fixes</w:t>
       </w:r>
     </w:p>
     <w:p>

</xml_diff>

<commit_message>
Auto-save: 3 file(s) — 2026-09-29 11:11
</commit_message>
<xml_diff>
--- a/Notes/2026-09-29-iso-27001-stage1-marketing-submission.docx
+++ b/Notes/2026-09-29-iso-27001-stage1-marketing-submission.docx
@@ -288,7 +288,7 @@
                 <w:sz w:val="18"/>
                 <w:szCs w:val="18"/>
               </w:rPr>
-              <w:t xml:space="preserve">1.2 (updated 29 September 2026: slide library review added as gap G14)</w:t>
+              <w:t xml:space="preserve">1.3 (updated 29 September 2026: revamped footer description, HR headcount of 90, current leadership designations, clients named)</w:t>
             </w:r>
           </w:p>
         </w:tc>
@@ -1274,10 +1274,58 @@
       <w:r>
         <w:rPr>
           <w:rFonts w:ascii="Calibri" w:cs="Calibri" w:eastAsia="Calibri" w:hAnsi="Calibri"/>
+          <w:b/>
+          <w:bCs/>
           <w:sz w:val="21"/>
           <w:szCs w:val="21"/>
         </w:rPr>
-        <w:t xml:space="preserve">The standard company description, used in the footer of every page on the website:</w:t>
+        <w:t xml:space="preserve">Revamped homepage footer (from the October 2026 launch). </w:t>
+      </w:r>
+      <w:r>
+        <w:rPr>
+          <w:rFonts w:ascii="Calibri" w:cs="Calibri" w:eastAsia="Calibri" w:hAnsi="Calibri"/>
+          <w:sz w:val="21"/>
+          <w:szCs w:val="21"/>
+        </w:rPr>
+        <w:t xml:space="preserve">This is the approved company description:</w:t>
+      </w:r>
+    </w:p>
+    <w:p>
+      <w:pPr>
+        <w:spacing w:after="120"/>
+      </w:pPr>
+      <w:r>
+        <w:rPr>
+          <w:rFonts w:ascii="Calibri" w:cs="Calibri" w:eastAsia="Calibri" w:hAnsi="Calibri"/>
+          <w:i/>
+          <w:iCs/>
+          <w:sz w:val="21"/>
+          <w:szCs w:val="21"/>
+        </w:rPr>
+        <w:t xml:space="preserve">“xLoop is a global AI and data consulting firm, serving high-growth startups, enterprises and public sector clients worldwide. We specialize in Gen AI, Computer Vision, AI Security, and end-to-end data management solutions, partnering with leaders who want to win.”</w:t>
+      </w:r>
+    </w:p>
+    <w:p>
+      <w:pPr>
+        <w:spacing w:after="120"/>
+      </w:pPr>
+      <w:r>
+        <w:rPr>
+          <w:rFonts w:ascii="Calibri" w:cs="Calibri" w:eastAsia="Calibri" w:hAnsi="Calibri"/>
+          <w:b/>
+          <w:bCs/>
+          <w:sz w:val="21"/>
+          <w:szCs w:val="21"/>
+        </w:rPr>
+        <w:t xml:space="preserve">Current live footer (until launch). </w:t>
+      </w:r>
+      <w:r>
+        <w:rPr>
+          <w:rFonts w:ascii="Calibri" w:cs="Calibri" w:eastAsia="Calibri" w:hAnsi="Calibri"/>
+          <w:sz w:val="21"/>
+          <w:szCs w:val="21"/>
+        </w:rPr>
+        <w:t xml:space="preserve">This is the version on every page today. The new wording replaces “Fortune 500s” with “high-growth startups, enterprises”:</w:t>
       </w:r>
     </w:p>
     <w:p>
@@ -1817,7 +1865,7 @@
                 <w:sz w:val="18"/>
                 <w:szCs w:val="18"/>
               </w:rPr>
-              <w:t xml:space="preserve">70+ engineers</w:t>
+              <w:t xml:space="preserve">90, per HR (September 2026). Includes consultants across the globe; excludes interns, who are temporary and not permanent resources</w:t>
             </w:r>
           </w:p>
         </w:tc>
@@ -1840,7 +1888,7 @@
                 <w:sz w:val="18"/>
                 <w:szCs w:val="18"/>
               </w:rPr>
-              <w:t xml:space="preserve">Website About page says 80+ employees. See gap G2</w:t>
+              <w:t xml:space="preserve">Website About page says 80+ employees; slide library says 120+. See gaps G2 and G14</w:t>
             </w:r>
           </w:p>
         </w:tc>
@@ -2265,7 +2313,7 @@
           <w:sz w:val="21"/>
           <w:szCs w:val="21"/>
         </w:rPr>
-        <w:t xml:space="preserve">The website About page lists: Mir Nasir (Founder/CEO), Ali Abbasi (VP Training &amp; Development), Atir Ahsan (GM Finance), Sarosh Syed (Head of Sales), Daniyal Abbasi (Head of AI Solutions &amp; Consulting), Sana Qazi (Head of Marketing &amp; AI Transformation), Omema Kamran (People &amp; Culture Lead), Farrukh Feroze (Head of AI Security), Faraz Ahmed (Manager Administration), Abdul Wasey Siddique (Principal Cloud Engineer), Hasan Haider Jafri (Client Enablement &amp; AI Insights Lead). Some titles are out of date. See gap G13.</w:t>
+        <w:t xml:space="preserve">The website About page lists: Mir Nasir (Founder/CEO), Ali Abbasi (VP Training &amp; Development), Atir Ahsan (GM Finance), Sarosh Syed (Chief Growth Officer), Daniyal Abbasi (Chief Operating Officer), Sana Qazi (Head of Marketing &amp; AI Transformation), Omema Kamran (People &amp; Culture Lead), Farrukh Feroze (Head of AI Security), Faraz Ahmed (Manager Administration), Abdul Wasey Siddique (Principal Cloud Engineer), Hasan Haider Jafri (Client Enablement &amp; AI Insights Lead). The designations above are current. The live About page still shows Sarosh Syed as Head of Sales and Daniyal Abbasi as Head of AI Solutions &amp; Consulting. See gap G13.</w:t>
       </w:r>
     </w:p>
     <w:p>
@@ -7317,7 +7365,7 @@
           <w:sz w:val="21"/>
           <w:szCs w:val="21"/>
         </w:rPr>
-        <w:t xml:space="preserve">board deck slides (company overview, edge, why we win) and two client case-study decks marked internal-only. These are excluded from this submission on purpose.</w:t>
+        <w:t xml:space="preserve">board deck slides (company overview, edge, why we win) and the Majid Al Futtaim / Wefi Tech case-study deck, which is internal-only because naming permission is pending. These are excluded from this submission on purpose.</w:t>
       </w:r>
     </w:p>
     <w:p>
@@ -7737,7 +7785,7 @@
                 <w:sz w:val="18"/>
                 <w:szCs w:val="18"/>
               </w:rPr>
-              <w:t xml:space="preserve">LLM assistant that reads 40+ page fund reports for an asset management firm</w:t>
+              <w:t xml:space="preserve">LLM assistant that reads 40+ page fund reports, delivered for Alfalah Investments</w:t>
             </w:r>
           </w:p>
         </w:tc>
@@ -8474,7 +8522,7 @@
                 <w:sz w:val="18"/>
                 <w:szCs w:val="18"/>
               </w:rPr>
-              <w:t xml:space="preserve">“xLoop Digital's NEPRA audits are led by certified ISO 27001 and ISO 42001 Lead Auditors”; delivered a full IT/OT compliance audit for a 30 MW wind IPP (anonymized); OT is assessed passively and “No plant downtime is required”; “inside a digital engineering firm operating across eight countries”</w:t>
+              <w:t xml:space="preserve">“xLoop Digital's NEPRA audits are led by certified ISO 27001 and ISO 42001 Lead Auditors”; delivered a full IT/OT compliance audit for a 30 MW wind IPP (ACT Wind, anonymized on the page); OT is assessed passively and “No plant downtime is required”; “inside a digital engineering firm operating across eight countries”</w:t>
             </w:r>
           </w:p>
         </w:tc>
@@ -8735,7 +8783,7 @@
                 <w:sz w:val="18"/>
                 <w:szCs w:val="18"/>
               </w:rPr>
-              <w:t xml:space="preserve">Case studies (anonymized)</w:t>
+              <w:t xml:space="preserve">Case studies (anonymized in public material)</w:t>
             </w:r>
           </w:p>
         </w:tc>
@@ -9074,7 +9122,19 @@
                 <w:sz w:val="18"/>
                 <w:szCs w:val="18"/>
               </w:rPr>
-              <w:t xml:space="preserve">Publicly named: Alfalah Investments, HBL Asset Management, Beythak, Eatsy, Pick n Pay, Serefin, Skillforte, Cloud Titans and others on the website logo wall. Other clients are referenced only in anonymized form</w:t>
+              <w:t xml:space="preserve">Named publicly: Alfalah Investments, HBL Asset Management, Beythak, Eatsy, Pick n Pay, Serefin, Skillforte, Cloud Titans, Abhi, Govfinder, Octostar and others on the website logo wall.</w:t>
+            </w:r>
+          </w:p>
+          <w:p>
+            <w:r>
+              <w:rPr>
+                <w:rFonts w:ascii="Calibri" w:cs="Calibri" w:eastAsia="Calibri" w:hAnsi="Calibri"/>
+                <w:b w:val="false"/>
+                <w:bCs w:val="false"/>
+                <w:sz w:val="18"/>
+                <w:szCs w:val="18"/>
+              </w:rPr>
+              <w:t xml:space="preserve">Referenced only in anonymized form in public material: SS&amp;C (RPG and COBOL-to-Java modernization), IRD Global (national immunization platform), ACT Wind (NEPRA IT/OT audit), Changes on the Fly (AWS migration), Majid Al Futtaim (AWS-to-Azure migration plan, with Microsoft), Wefi Tech (Snowflake advisory), Kayali (resource augmentation)</w:t>
             </w:r>
           </w:p>
         </w:tc>
@@ -10840,7 +10900,7 @@
                 <w:sz w:val="18"/>
                 <w:szCs w:val="18"/>
               </w:rPr>
-              <w:t xml:space="preserve">Headcount shown as 80+; confirmed figure is 70+ engineers</w:t>
+              <w:t xml:space="preserve">Headcount shown as 80+ (About page) and 120+ (slide library); the HR figure is 90, including consultants and excluding interns</w:t>
             </w:r>
           </w:p>
         </w:tc>
@@ -10863,7 +10923,7 @@
                 <w:sz w:val="18"/>
                 <w:szCs w:val="18"/>
               </w:rPr>
-              <w:t xml:space="preserve">About Us page; older decks</w:t>
+              <w:t xml:space="preserve">About Us page; slide library</w:t>
             </w:r>
           </w:p>
         </w:tc>
@@ -10886,7 +10946,7 @@
                 <w:sz w:val="18"/>
                 <w:szCs w:val="18"/>
               </w:rPr>
-              <w:t xml:space="preserve">Align all materials to 70+</w:t>
+              <w:t xml:space="preserve">Align all materials to 90</w:t>
             </w:r>
           </w:p>
         </w:tc>
@@ -12380,7 +12440,7 @@
                 <w:sz w:val="18"/>
                 <w:szCs w:val="18"/>
               </w:rPr>
-              <w:t xml:space="preserve">Some leadership titles on the About page are out of date</w:t>
+              <w:t xml:space="preserve">Leadership titles on the About page are out of date: Sarosh Syed is now Chief Growth Officer (shown as Head of Sales) and Daniyal Abbasi is Chief Operating Officer (shown as Head of AI Solutions &amp; Consulting)</w:t>
             </w:r>
           </w:p>
         </w:tc>
@@ -12403,7 +12463,7 @@
                 <w:sz w:val="18"/>
                 <w:szCs w:val="18"/>
               </w:rPr>
-              <w:t xml:space="preserve">About Us page</w:t>
+              <w:t xml:space="preserve">About Us page; slide library (slide 22)</w:t>
             </w:r>
           </w:p>
         </w:tc>
@@ -12426,7 +12486,7 @@
                 <w:sz w:val="18"/>
                 <w:szCs w:val="18"/>
               </w:rPr>
-              <w:t xml:space="preserve">Update titles with HR</w:t>
+              <w:t xml:space="preserve">Update titles; check the other titles with HR</w:t>
             </w:r>
           </w:p>
         </w:tc>

</xml_diff>